<commit_message>
Fix stale flip_attr reference; refresh and reorganise test docs
Code fix:
- Remove lingering flip_attr reference from node_wsp() paste0() call
  (variable was removed in previous commit but the XML string still
  referenced it, causing a runtime error)

Test documents:
- Move documents.mermaid and waste-CSM2.mermaid into examples/ (renamed
  to waste-CSM-styled.mermaid) alongside the other canonical diagrams
- Re-render all test docs fresh: waste-CSM, waste-CSM-styled, documents,
  EMP-SMART, Infrastructure-CSM1, text-clipping-test, all-shapes
- Delete all diagnostic artefacts: text-clipping-pad*.docx/svg,
  documents-v4/v5.docx, waste-v2.docx, old text-clipping-test versions,
  intermediate SVG files, Word lock file, output.docx
- Skip Infrastructure-CSM2.mermaid: uses invalid :::@@{...}@@ syntax

Co-Authored-By: Claude Sonnet 4.6 <noreply@anthropic.com>
</commit_message>
<xml_diff>
--- a/dev/text-clipping-test.docx
+++ b/dev/text-clipping-test.docx
@@ -74,6 +74,7 @@
                                 </w:pPr>
                                 <w:r>
                                   <w:rPr>
+                                    <w:rFonts w:ascii="Trebuchet MS" w:hAnsi="Trebuchet MS" w:cs="Trebuchet MS"/>
                                     <w:color w:val="000000"/>
                                     <w:sz w:val="17"/>
                                     <w:szCs w:val="17"/>
@@ -83,7 +84,7 @@
                               </w:p>
                             </w:txbxContent>
                           </wps:txbx>
-                          <wps:bodyPr anchor="t" lIns="64074" rIns="64074" tIns="32037" bIns="32037">
+                          <wps:bodyPr anchor="t" lIns="0" rIns="0" tIns="0" bIns="0">
                             <a:normAutofit/>
                           </wps:bodyPr>
                         </wps:wsp>
@@ -117,6 +118,7 @@
                                 </w:pPr>
                                 <w:r>
                                   <w:rPr>
+                                    <w:rFonts w:ascii="Trebuchet MS" w:hAnsi="Trebuchet MS" w:cs="Trebuchet MS"/>
                                     <w:color w:val="000000"/>
                                     <w:sz w:val="17"/>
                                     <w:szCs w:val="17"/>
@@ -126,7 +128,7 @@
                               </w:p>
                             </w:txbxContent>
                           </wps:txbx>
-                          <wps:bodyPr anchor="ctr" lIns="64074" rIns="64074" tIns="32037" bIns="32037">
+                          <wps:bodyPr anchor="ctr" lIns="0" rIns="0" tIns="0" bIns="0">
                             <a:normAutofit/>
                           </wps:bodyPr>
                         </wps:wsp>
@@ -160,6 +162,7 @@
                                 </w:pPr>
                                 <w:r>
                                   <w:rPr>
+                                    <w:rFonts w:ascii="Trebuchet MS" w:hAnsi="Trebuchet MS" w:cs="Trebuchet MS"/>
                                     <w:color w:val="000000"/>
                                     <w:sz w:val="17"/>
                                     <w:szCs w:val="17"/>
@@ -169,7 +172,7 @@
                               </w:p>
                             </w:txbxContent>
                           </wps:txbx>
-                          <wps:bodyPr anchor="ctr" lIns="64074" rIns="64074" tIns="32037" bIns="32037">
+                          <wps:bodyPr anchor="ctr" lIns="0" rIns="0" tIns="0" bIns="0">
                             <a:normAutofit/>
                           </wps:bodyPr>
                         </wps:wsp>
@@ -203,6 +206,7 @@
                                 </w:pPr>
                                 <w:r>
                                   <w:rPr>
+                                    <w:rFonts w:ascii="Trebuchet MS" w:hAnsi="Trebuchet MS" w:cs="Trebuchet MS"/>
                                     <w:color w:val="000000"/>
                                     <w:sz w:val="17"/>
                                     <w:szCs w:val="17"/>
@@ -212,7 +216,7 @@
                               </w:p>
                             </w:txbxContent>
                           </wps:txbx>
-                          <wps:bodyPr anchor="ctr" lIns="64074" rIns="64074" tIns="32037" bIns="32037">
+                          <wps:bodyPr anchor="ctr" lIns="0" rIns="0" tIns="0" bIns="0">
                             <a:normAutofit/>
                           </wps:bodyPr>
                         </wps:wsp>
@@ -246,6 +250,7 @@
                                 </w:pPr>
                                 <w:r>
                                   <w:rPr>
+                                    <w:rFonts w:ascii="Trebuchet MS" w:hAnsi="Trebuchet MS" w:cs="Trebuchet MS"/>
                                     <w:color w:val="000000"/>
                                     <w:sz w:val="17"/>
                                     <w:szCs w:val="17"/>
@@ -255,7 +260,7 @@
                               </w:p>
                             </w:txbxContent>
                           </wps:txbx>
-                          <wps:bodyPr anchor="ctr" lIns="64074" rIns="64074" tIns="32037" bIns="32037">
+                          <wps:bodyPr anchor="ctr" lIns="0" rIns="0" tIns="0" bIns="0">
                             <a:normAutofit/>
                           </wps:bodyPr>
                         </wps:wsp>
@@ -289,6 +294,7 @@
                                 </w:pPr>
                                 <w:r>
                                   <w:rPr>
+                                    <w:rFonts w:ascii="Trebuchet MS" w:hAnsi="Trebuchet MS" w:cs="Trebuchet MS"/>
                                     <w:color w:val="000000"/>
                                     <w:sz w:val="17"/>
                                     <w:szCs w:val="17"/>
@@ -298,7 +304,7 @@
                               </w:p>
                             </w:txbxContent>
                           </wps:txbx>
-                          <wps:bodyPr anchor="ctr" lIns="64074" rIns="64074" tIns="32037" bIns="32037">
+                          <wps:bodyPr anchor="ctr" lIns="0" rIns="0" tIns="0" bIns="0">
                             <a:normAutofit/>
                           </wps:bodyPr>
                         </wps:wsp>
@@ -332,6 +338,7 @@
                                 </w:pPr>
                                 <w:r>
                                   <w:rPr>
+                                    <w:rFonts w:ascii="Trebuchet MS" w:hAnsi="Trebuchet MS" w:cs="Trebuchet MS"/>
                                     <w:color w:val="000000"/>
                                     <w:sz w:val="17"/>
                                     <w:szCs w:val="17"/>
@@ -341,7 +348,7 @@
                               </w:p>
                             </w:txbxContent>
                           </wps:txbx>
-                          <wps:bodyPr anchor="ctr" lIns="64074" rIns="64074" tIns="32037" bIns="32037">
+                          <wps:bodyPr anchor="ctr" lIns="0" rIns="0" tIns="0" bIns="0">
                             <a:normAutofit/>
                           </wps:bodyPr>
                         </wps:wsp>
@@ -375,6 +382,7 @@
                                 </w:pPr>
                                 <w:r>
                                   <w:rPr>
+                                    <w:rFonts w:ascii="Trebuchet MS" w:hAnsi="Trebuchet MS" w:cs="Trebuchet MS"/>
                                     <w:color w:val="000000"/>
                                     <w:sz w:val="17"/>
                                     <w:szCs w:val="17"/>
@@ -384,7 +392,7 @@
                               </w:p>
                             </w:txbxContent>
                           </wps:txbx>
-                          <wps:bodyPr anchor="ctr" lIns="64074" rIns="64074" tIns="32037" bIns="32037">
+                          <wps:bodyPr anchor="ctr" lIns="0" rIns="0" tIns="0" bIns="0">
                             <a:normAutofit/>
                           </wps:bodyPr>
                         </wps:wsp>
@@ -418,6 +426,7 @@
                                 </w:pPr>
                                 <w:r>
                                   <w:rPr>
+                                    <w:rFonts w:ascii="Trebuchet MS" w:hAnsi="Trebuchet MS" w:cs="Trebuchet MS"/>
                                     <w:color w:val="000000"/>
                                     <w:sz w:val="17"/>
                                     <w:szCs w:val="17"/>
@@ -427,7 +436,7 @@
                               </w:p>
                             </w:txbxContent>
                           </wps:txbx>
-                          <wps:bodyPr anchor="ctr" lIns="64074" rIns="64074" tIns="32037" bIns="32037">
+                          <wps:bodyPr anchor="ctr" lIns="0" rIns="0" tIns="0" bIns="0">
                             <a:normAutofit/>
                           </wps:bodyPr>
                         </wps:wsp>
@@ -471,6 +480,7 @@
                                 </w:pPr>
                                 <w:r>
                                   <w:rPr>
+                                    <w:rFonts w:ascii="Trebuchet MS" w:hAnsi="Trebuchet MS" w:cs="Trebuchet MS"/>
                                     <w:color w:val="000000"/>
                                     <w:sz w:val="17"/>
                                     <w:szCs w:val="17"/>
@@ -480,7 +490,7 @@
                               </w:p>
                             </w:txbxContent>
                           </wps:txbx>
-                          <wps:bodyPr anchor="t" lIns="64074" rIns="64074" tIns="32037" bIns="32037">
+                          <wps:bodyPr anchor="t" lIns="0" rIns="0" tIns="0" bIns="0">
                             <a:normAutofit/>
                           </wps:bodyPr>
                         </wps:wsp>
@@ -512,6 +522,7 @@
                                 </w:pPr>
                                 <w:r>
                                   <w:rPr>
+                                    <w:rFonts w:ascii="Trebuchet MS" w:hAnsi="Trebuchet MS" w:cs="Trebuchet MS"/>
                                     <w:color w:val="000000"/>
                                     <w:sz w:val="17"/>
                                     <w:szCs w:val="17"/>
@@ -521,7 +532,7 @@
                               </w:p>
                             </w:txbxContent>
                           </wps:txbx>
-                          <wps:bodyPr anchor="ctr" lIns="64074" rIns="64074" tIns="32037" bIns="32037">
+                          <wps:bodyPr anchor="ctr" lIns="0" rIns="0" tIns="0" bIns="0">
                             <a:normAutofit/>
                           </wps:bodyPr>
                         </wps:wsp>
@@ -553,6 +564,7 @@
                                 </w:pPr>
                                 <w:r>
                                   <w:rPr>
+                                    <w:rFonts w:ascii="Trebuchet MS" w:hAnsi="Trebuchet MS" w:cs="Trebuchet MS"/>
                                     <w:color w:val="000000"/>
                                     <w:sz w:val="17"/>
                                     <w:szCs w:val="17"/>
@@ -562,7 +574,7 @@
                               </w:p>
                             </w:txbxContent>
                           </wps:txbx>
-                          <wps:bodyPr anchor="ctr" lIns="64074" rIns="64074" tIns="32037" bIns="32037">
+                          <wps:bodyPr anchor="ctr" lIns="0" rIns="0" tIns="0" bIns="0">
                             <a:normAutofit/>
                           </wps:bodyPr>
                         </wps:wsp>
@@ -594,6 +606,7 @@
                                 </w:pPr>
                                 <w:r>
                                   <w:rPr>
+                                    <w:rFonts w:ascii="Trebuchet MS" w:hAnsi="Trebuchet MS" w:cs="Trebuchet MS"/>
                                     <w:color w:val="000000"/>
                                     <w:sz w:val="17"/>
                                     <w:szCs w:val="17"/>
@@ -603,7 +616,7 @@
                               </w:p>
                             </w:txbxContent>
                           </wps:txbx>
-                          <wps:bodyPr anchor="ctr" lIns="64074" rIns="64074" tIns="32037" bIns="32037">
+                          <wps:bodyPr anchor="ctr" lIns="0" rIns="0" tIns="0" bIns="0">
                             <a:normAutofit/>
                           </wps:bodyPr>
                         </wps:wsp>
@@ -635,6 +648,7 @@
                                 </w:pPr>
                                 <w:r>
                                   <w:rPr>
+                                    <w:rFonts w:ascii="Trebuchet MS" w:hAnsi="Trebuchet MS" w:cs="Trebuchet MS"/>
                                     <w:color w:val="000000"/>
                                     <w:sz w:val="17"/>
                                     <w:szCs w:val="17"/>
@@ -644,7 +658,7 @@
                               </w:p>
                             </w:txbxContent>
                           </wps:txbx>
-                          <wps:bodyPr anchor="ctr" lIns="64074" rIns="64074" tIns="32037" bIns="32037">
+                          <wps:bodyPr anchor="ctr" lIns="0" rIns="0" tIns="0" bIns="0">
                             <a:normAutofit/>
                           </wps:bodyPr>
                         </wps:wsp>
@@ -676,6 +690,7 @@
                                 </w:pPr>
                                 <w:r>
                                   <w:rPr>
+                                    <w:rFonts w:ascii="Trebuchet MS" w:hAnsi="Trebuchet MS" w:cs="Trebuchet MS"/>
                                     <w:color w:val="000000"/>
                                     <w:sz w:val="17"/>
                                     <w:szCs w:val="17"/>
@@ -685,7 +700,7 @@
                               </w:p>
                             </w:txbxContent>
                           </wps:txbx>
-                          <wps:bodyPr anchor="ctr" lIns="64074" rIns="64074" tIns="32037" bIns="32037">
+                          <wps:bodyPr anchor="ctr" lIns="0" rIns="0" tIns="0" bIns="0">
                             <a:normAutofit/>
                           </wps:bodyPr>
                         </wps:wsp>
@@ -717,6 +732,7 @@
                                 </w:pPr>
                                 <w:r>
                                   <w:rPr>
+                                    <w:rFonts w:ascii="Trebuchet MS" w:hAnsi="Trebuchet MS" w:cs="Trebuchet MS"/>
                                     <w:color w:val="000000"/>
                                     <w:sz w:val="17"/>
                                     <w:szCs w:val="17"/>
@@ -726,7 +742,7 @@
                               </w:p>
                             </w:txbxContent>
                           </wps:txbx>
-                          <wps:bodyPr anchor="ctr" lIns="64074" rIns="64074" tIns="32037" bIns="32037">
+                          <wps:bodyPr anchor="ctr" lIns="0" rIns="0" tIns="0" bIns="0">
                             <a:normAutofit/>
                           </wps:bodyPr>
                         </wps:wsp>
@@ -758,6 +774,7 @@
                                 </w:pPr>
                                 <w:r>
                                   <w:rPr>
+                                    <w:rFonts w:ascii="Trebuchet MS" w:hAnsi="Trebuchet MS" w:cs="Trebuchet MS"/>
                                     <w:color w:val="000000"/>
                                     <w:sz w:val="17"/>
                                     <w:szCs w:val="17"/>
@@ -767,7 +784,7 @@
                               </w:p>
                             </w:txbxContent>
                           </wps:txbx>
-                          <wps:bodyPr anchor="ctr" lIns="64074" rIns="64074" tIns="32037" bIns="32037">
+                          <wps:bodyPr anchor="ctr" lIns="0" rIns="0" tIns="0" bIns="0">
                             <a:normAutofit/>
                           </wps:bodyPr>
                         </wps:wsp>
@@ -799,6 +816,7 @@
                                 </w:pPr>
                                 <w:r>
                                   <w:rPr>
+                                    <w:rFonts w:ascii="Trebuchet MS" w:hAnsi="Trebuchet MS" w:cs="Trebuchet MS"/>
                                     <w:color w:val="000000"/>
                                     <w:sz w:val="17"/>
                                     <w:szCs w:val="17"/>
@@ -808,7 +826,7 @@
                               </w:p>
                             </w:txbxContent>
                           </wps:txbx>
-                          <wps:bodyPr anchor="ctr" lIns="64074" rIns="64074" tIns="32037" bIns="32037">
+                          <wps:bodyPr anchor="ctr" lIns="0" rIns="0" tIns="0" bIns="0">
                             <a:normAutofit/>
                           </wps:bodyPr>
                         </wps:wsp>

</xml_diff>